<commit_message>
fix: persist cloned Word rows and page settings
</commit_message>
<xml_diff>
--- a/src/test/resources/fixtures/templates/report-template.docx
+++ b/src/test/resources/fixtures/templates/report-template.docx
@@ -228,6 +228,10 @@
         <w:t>页眉页脚与模板样式保留标记</w:t>
       </w:r>
     </w:p>
+    <w:sectPr>
+      <w:pgSz w:w="11906" w:h="16838"/>
+      <w:pgMar w:top="1440" w:right="1440" w:bottom="1440" w:left="1440" w:header="720" w:footer="720" w:gutter="0"/>
+    </w:sectPr>
   </w:body>
 </w:document>
 </file>

</xml_diff>

<commit_message>
feat: preserve Word template layout and image alignment
</commit_message>
<xml_diff>
--- a/src/test/resources/fixtures/templates/report-template.docx
+++ b/src/test/resources/fixtures/templates/report-template.docx
@@ -1,6 +1,6 @@
 
 <file path=word/document.xml><?xml version="1.0" encoding="utf-8"?>
-<w:document xmlns:w="http://schemas.openxmlformats.org/wordprocessingml/2006/main">
+<w:document xmlns:w="http://schemas.openxmlformats.org/wordprocessingml/2006/main" xmlns:r="http://schemas.openxmlformats.org/officeDocument/2006/relationships">
   <w:body>
     <w:p>
       <w:pPr>
@@ -229,6 +229,8 @@
       </w:r>
     </w:p>
     <w:sectPr>
+      <w:headerReference w:type="default" r:id="rId5"/>
+      <w:footerReference w:type="default" r:id="rId6"/>
       <w:pgSz w:w="11906" w:h="16838"/>
       <w:pgMar w:top="1440" w:right="1440" w:bottom="1440" w:left="1440" w:header="720" w:footer="720" w:gutter="0"/>
     </w:sectPr>
@@ -236,8 +238,91 @@
 </w:document>
 </file>
 
+<file path=word/footer1.xml><?xml version="1.0" encoding="utf-8"?>
+<w:ftr xmlns:w="http://schemas.openxmlformats.org/wordprocessingml/2006/main">
+  <w:p>
+    <w:pPr>
+      <w:jc w:val="center"/>
+    </w:pPr>
+    <w:r>
+      <w:t>模板页脚标记 | {{cover:preparedDate}}</w:t>
+    </w:r>
+  </w:p>
+</w:ftr>
+</file>
+
+<file path=word/header1.xml><?xml version="1.0" encoding="utf-8"?>
+<w:hdr xmlns:w="http://schemas.openxmlformats.org/wordprocessingml/2006/main">
+  <w:p>
+    <w:pPr>
+      <w:jc w:val="right"/>
+    </w:pPr>
+    <w:r>
+      <w:t>模板页眉标记 | {{cover:organization}}</w:t>
+    </w:r>
+  </w:p>
+</w:hdr>
+</file>
+
+<file path=word/numbering.xml><?xml version="1.0" encoding="utf-8"?>
+<w:numbering xmlns:w="http://schemas.openxmlformats.org/wordprocessingml/2006/main">
+  <w:abstractNum w:abstractNumId="0">
+    <w:multiLevelType w:val="multilevel"/>
+    <w:lvl w:ilvl="0">
+      <w:start w:val="1"/>
+      <w:numFmt w:val="chineseCounting"/>
+      <w:lvlText w:val="%1、"/>
+      <w:lvlJc w:val="left"/>
+      <w:pPr>
+        <w:ind w:left="360" w:hanging="360"/>
+      </w:pPr>
+    </w:lvl>
+    <w:lvl w:ilvl="1">
+      <w:start w:val="1"/>
+      <w:numFmt w:val="decimal"/>
+      <w:lvlText w:val="%1.%2"/>
+      <w:lvlJc w:val="left"/>
+      <w:pPr>
+        <w:ind w:left="1080" w:hanging="720"/>
+      </w:pPr>
+    </w:lvl>
+    <w:lvl w:ilvl="2">
+      <w:start w:val="1"/>
+      <w:numFmt w:val="decimal"/>
+      <w:lvlText w:val="（%3）"/>
+      <w:lvlJc w:val="left"/>
+      <w:pPr>
+        <w:ind w:left="1800" w:hanging="1080"/>
+      </w:pPr>
+    </w:lvl>
+    <w:lvl w:ilvl="3">
+      <w:start w:val="1"/>
+      <w:numFmt w:val="decimalEnclosedCircle"/>
+      <w:lvlText w:val="%4"/>
+      <w:lvlJc w:val="left"/>
+      <w:pPr>
+        <w:ind w:left="2520" w:hanging="1440"/>
+      </w:pPr>
+    </w:lvl>
+  </w:abstractNum>
+  <w:num w:numId="1">
+    <w:abstractNumId w:val="0"/>
+  </w:num>
+</w:numbering>
+</file>
+
 <file path=word/styles.xml><?xml version="1.0" encoding="utf-8"?>
 <w:styles xmlns:w="http://schemas.openxmlformats.org/wordprocessingml/2006/main">
+  <w:style w:styleId="ReportBody" w:type="paragraph">
+    <w:name w:val="Report Body"/>
+    <w:basedOn w:val="Normal"/>
+    <w:next w:val="ReportBody"/>
+    <w:rPr>
+      <w:rFonts w:ascii="SimSun" w:hAnsi="SimSun" w:eastAsia="SimSun"/>
+      <w:sz w:val="21"/>
+      <w:szCs w:val="21"/>
+    </w:rPr>
+  </w:style>
   <w:style w:styleId="Heading1" w:type="paragraph">
     <w:name w:val="Heading 1"/>
     <w:basedOn w:val="Normal"/>
@@ -299,4 +384,8 @@
     </w:rPr>
   </w:style>
 </w:styles>
+</file>
+
+<file path=word/theme/theme1.xml><?xml version="1.0" encoding="utf-8"?>
+<a:theme xmlns:a="http://schemas.openxmlformats.org/drawingml/2006/main" name="XN Report Theme"/>
 </file>
</xml_diff>